<commit_message>
docs: regenerate question bank after Mo edits (PR #29)
Regenerated docs/hive_insightout_question_bank_20260608.docx from the
current app/public/assessment.js (54 question-bank edits merged in PR #29).
56 content strings changed in the doc (items 9 & 10 render in two places each).

Also updates scripts/extract_question_bank.js: the two open-response prompts
(type-open / instinct-open) are hard-coded in the extractor's prose block, so
they were updated to the new wording for a faithful regen. Regenerated the
tracked intermediate scripts/.question_bank_data.json to match.

Co-Authored-By: Claude Opus 4.8 <noreply@anthropic.com>
</commit_message>
<xml_diff>
--- a/docs/hive_insightout_question_bank_20260608.docx
+++ b/docs/hive_insightout_question_bank_20260608.docx
@@ -168,7 +168,7 @@
         <w:rPr>
           <w:sz w:val="21"/>
         </w:rPr>
-        <w:t>Which of the words or phrases you listed is your greatest strength?</w:t>
+        <w:t>Which of the words or phrases you listed is your greatest strength, and why?</w:t>
       </w:r>
     </w:p>
     <w:p>
@@ -218,7 +218,7 @@
         <w:rPr>
           <w:sz w:val="21"/>
         </w:rPr>
-        <w:t>Which of the words or phrases you listed tends to be most problematic for you?</w:t>
+        <w:t>Which of the words or phrases you listed tends to be most problematic for you, and why?</w:t>
       </w:r>
     </w:p>
     <w:p>
@@ -379,7 +379,7 @@
           <w:color w:val="7A7A7A"/>
           <w:sz w:val="16"/>
         </w:rPr>
-        <w:t>source · assessment.js:L1615  ·  renderMidAssessmentReminders()</w:t>
+        <w:t>source · assessment.js:L2002  ·  renderMidAssessmentReminders()</w:t>
       </w:r>
     </w:p>
     <w:p/>
@@ -785,7 +785,7 @@
         <w:rPr>
           <w:sz w:val="21"/>
         </w:rPr>
-        <w:t>I find myself running through worst-case scenarios figuring out how to be prepared for what might happen.</w:t>
+        <w:t>I find myself running through worst-case scenarios and figuring out how to be prepared for what might happen.</w:t>
       </w:r>
     </w:p>
     <w:p>
@@ -1078,7 +1078,7 @@
         <w:rPr>
           <w:sz w:val="21"/>
         </w:rPr>
-        <w:t>I put a lot of energy into accommodating others, staying comfortable, and avoiding friction.</w:t>
+        <w:t>I put a lot of energy into accommodating others, staying comfortable, and keeping the peace.</w:t>
       </w:r>
     </w:p>
     <w:p>
@@ -2488,7 +2488,7 @@
         <w:rPr>
           <w:sz w:val="21"/>
         </w:rPr>
-        <w:t>I find myself planning for pleasurable possibilities, generating new options, and reframing whatever feels limiting or painful.</w:t>
+        <w:t>I find myself imagining enjoyable possibilities, generating new options, and reframing negatives into positives.</w:t>
       </w:r>
     </w:p>
     <w:p>
@@ -2626,7 +2626,7 @@
         <w:rPr>
           <w:sz w:val="21"/>
         </w:rPr>
-        <w:t>Is there anything about what drives you that those statements didn’t capture? (Optional)</w:t>
+        <w:t>Our core motivations are often hard to pin down. If there’s something about what drives you that the previous statements didn’t capture, add it here.</w:t>
       </w:r>
     </w:p>
     <w:p>
@@ -2652,7 +2652,7 @@
           <w:color w:val="7A7A7A"/>
           <w:sz w:val="16"/>
         </w:rPr>
-        <w:t>source · assessment.js:L1699  ·  renderStage1() — kind:'type-open'</w:t>
+        <w:t>source · assessment.js:L2078  ·  renderStage1() — kind:'type-open'</w:t>
       </w:r>
     </w:p>
     <w:p/>
@@ -2764,7 +2764,7 @@
         <w:rPr>
           <w:sz w:val="21"/>
         </w:rPr>
-        <w:t>I keep track of whether I have enough resources (money, supplies, energy, time, etc) to ensure comfort and survival.</w:t>
+        <w:t>I keep track of whether I have enough resources (money, supplies, energy, time, etc.) to ensure comfort and survival.</w:t>
       </w:r>
     </w:p>
     <w:p>
@@ -3045,7 +3045,7 @@
         <w:rPr>
           <w:sz w:val="21"/>
         </w:rPr>
-        <w:t>I notice the social landscape — who’s connected to whom, who’s in, who’s on the outside.</w:t>
+        <w:t>I notice the social landscape — who’s connected to whom, who’s in, and who’s out.</w:t>
       </w:r>
     </w:p>
     <w:p>
@@ -3090,7 +3090,7 @@
         <w:rPr>
           <w:sz w:val="21"/>
         </w:rPr>
-        <w:t>I am pulled toward something larger than myself: a cause, a community, a group I want to be part of.</w:t>
+        <w:t>I am pulled toward something larger than myself: a cause, a community, or a group I want to be part of.</w:t>
       </w:r>
     </w:p>
     <w:p>
@@ -3419,7 +3419,7 @@
         <w:rPr>
           <w:sz w:val="21"/>
         </w:rPr>
-        <w:t>Is there anything about where your attention and energy naturally go that you’d like to add? (Optional)</w:t>
+        <w:t>Instinct patterns can be subtle. If there’s something about where your attention and energy naturally go that the statements didn’t quite land on, add it here.</w:t>
       </w:r>
     </w:p>
     <w:p>
@@ -3445,7 +3445,7 @@
           <w:color w:val="7A7A7A"/>
           <w:sz w:val="16"/>
         </w:rPr>
-        <w:t>source · assessment.js:L1700  ·  renderStage1() — kind:'instinct-open'</w:t>
+        <w:t>source · assessment.js:L2079  ·  renderStage1() — kind:'instinct-open'</w:t>
       </w:r>
     </w:p>
     <w:p/>
@@ -3577,7 +3577,7 @@
           <w:color w:val="7A7A7A"/>
           <w:sz w:val="16"/>
         </w:rPr>
-        <w:t>source · assessment.js:L381  ·  STAGE2_QUESTIONS[0] · framework=Hornevian</w:t>
+        <w:t>source · assessment.js:L382  ·  STAGE2_QUESTIONS[0] · framework=Hornevian</w:t>
       </w:r>
     </w:p>
     <w:p>
@@ -3685,7 +3685,7 @@
           <w:color w:val="7A7A7A"/>
           <w:sz w:val="16"/>
         </w:rPr>
-        <w:t>source · assessment.js:L393  ·  STAGE2_QUESTIONS[1] · framework=Harmonic</w:t>
+        <w:t>source · assessment.js:L394  ·  STAGE2_QUESTIONS[1] · framework=Harmonic</w:t>
       </w:r>
     </w:p>
     <w:p>
@@ -3793,7 +3793,7 @@
           <w:color w:val="7A7A7A"/>
           <w:sz w:val="16"/>
         </w:rPr>
-        <w:t>source · assessment.js:L405  ·  STAGE2_QUESTIONS[2] · framework=Centers</w:t>
+        <w:t>source · assessment.js:L406  ·  STAGE2_QUESTIONS[2] · framework=Centers</w:t>
       </w:r>
     </w:p>
     <w:p/>
@@ -3951,7 +3951,7 @@
           <w:color w:val="7A7A7A"/>
           <w:sz w:val="16"/>
         </w:rPr>
-        <w:t>source · assessment.js:L438  ·  STAGE3_Q1_STEM + render4WayOptions()</w:t>
+        <w:t>source · assessment.js:L439  ·  STAGE3_Q1_STEM + render4WayOptions()</w:t>
       </w:r>
     </w:p>
     <w:p>
@@ -4001,7 +4001,7 @@
           <w:color w:val="7A7A7A"/>
           <w:sz w:val="16"/>
         </w:rPr>
-        <w:t>source · assessment.js:L439  ·  STAGE3_Q2_STEM</w:t>
+        <w:t>source · assessment.js:L440  ·  STAGE3_Q2_STEM</w:t>
       </w:r>
     </w:p>
     <w:p>
@@ -4206,7 +4206,7 @@
           <w:color w:val="7A7A7A"/>
           <w:sz w:val="16"/>
         </w:rPr>
-        <w:t>source · assessment.js:L462  ·  STAGE3_Q2_PAIRS['1-6']</w:t>
+        <w:t>source · assessment.js:L463  ·  STAGE3_Q2_PAIRS['1-6']</w:t>
       </w:r>
     </w:p>
     <w:p>
@@ -4266,7 +4266,7 @@
           <w:color w:val="7A7A7A"/>
           <w:sz w:val="16"/>
         </w:rPr>
-        <w:t>source · assessment.js:L444  ·  STAGE3_CORE_MOTIVATIONS</w:t>
+        <w:t>source · assessment.js:L445  ·  STAGE3_CORE_MOTIVATIONS</w:t>
       </w:r>
     </w:p>
     <w:p>
@@ -4303,7 +4303,7 @@
           <w:color w:val="7A7A7A"/>
           <w:sz w:val="16"/>
         </w:rPr>
-        <w:t>source · assessment.js:L445  ·  STAGE3_CORE_MOTIVATIONS</w:t>
+        <w:t>source · assessment.js:L446  ·  STAGE3_CORE_MOTIVATIONS</w:t>
       </w:r>
     </w:p>
     <w:p>
@@ -4340,7 +4340,7 @@
           <w:color w:val="7A7A7A"/>
           <w:sz w:val="16"/>
         </w:rPr>
-        <w:t>source · assessment.js:L446  ·  STAGE3_CORE_MOTIVATIONS</w:t>
+        <w:t>source · assessment.js:L447  ·  STAGE3_CORE_MOTIVATIONS</w:t>
       </w:r>
     </w:p>
     <w:p>
@@ -4377,7 +4377,7 @@
           <w:color w:val="7A7A7A"/>
           <w:sz w:val="16"/>
         </w:rPr>
-        <w:t>source · assessment.js:L447  ·  STAGE3_CORE_MOTIVATIONS</w:t>
+        <w:t>source · assessment.js:L448  ·  STAGE3_CORE_MOTIVATIONS</w:t>
       </w:r>
     </w:p>
     <w:p>
@@ -4414,7 +4414,7 @@
           <w:color w:val="7A7A7A"/>
           <w:sz w:val="16"/>
         </w:rPr>
-        <w:t>source · assessment.js:L448  ·  STAGE3_CORE_MOTIVATIONS</w:t>
+        <w:t>source · assessment.js:L449  ·  STAGE3_CORE_MOTIVATIONS</w:t>
       </w:r>
     </w:p>
     <w:p>
@@ -4451,7 +4451,7 @@
           <w:color w:val="7A7A7A"/>
           <w:sz w:val="16"/>
         </w:rPr>
-        <w:t>source · assessment.js:L449  ·  STAGE3_CORE_MOTIVATIONS</w:t>
+        <w:t>source · assessment.js:L450  ·  STAGE3_CORE_MOTIVATIONS</w:t>
       </w:r>
     </w:p>
     <w:p>
@@ -4488,7 +4488,7 @@
           <w:color w:val="7A7A7A"/>
           <w:sz w:val="16"/>
         </w:rPr>
-        <w:t>source · assessment.js:L450  ·  STAGE3_CORE_MOTIVATIONS</w:t>
+        <w:t>source · assessment.js:L451  ·  STAGE3_CORE_MOTIVATIONS</w:t>
       </w:r>
     </w:p>
     <w:p>
@@ -4525,7 +4525,7 @@
           <w:color w:val="7A7A7A"/>
           <w:sz w:val="16"/>
         </w:rPr>
-        <w:t>source · assessment.js:L451  ·  STAGE3_CORE_MOTIVATIONS</w:t>
+        <w:t>source · assessment.js:L452  ·  STAGE3_CORE_MOTIVATIONS</w:t>
       </w:r>
     </w:p>
     <w:p>
@@ -4562,7 +4562,7 @@
           <w:color w:val="7A7A7A"/>
           <w:sz w:val="16"/>
         </w:rPr>
-        <w:t>source · assessment.js:L452  ·  STAGE3_CORE_MOTIVATIONS</w:t>
+        <w:t>source · assessment.js:L453  ·  STAGE3_CORE_MOTIVATIONS</w:t>
       </w:r>
     </w:p>
     <w:p>
@@ -4641,7 +4641,7 @@
           <w:color w:val="7A7A7A"/>
           <w:sz w:val="16"/>
         </w:rPr>
-        <w:t>source · assessment.js:L462  ·  STAGE3_Q2_PAIRS['1-6']</w:t>
+        <w:t>source · assessment.js:L463  ·  STAGE3_Q2_PAIRS['1-6']</w:t>
       </w:r>
     </w:p>
     <w:p>
@@ -4697,7 +4697,7 @@
           <w:color w:val="7A7A7A"/>
           <w:sz w:val="16"/>
         </w:rPr>
-        <w:t>source · assessment.js:L463  ·  STAGE3_Q2_PAIRS['1-9']</w:t>
+        <w:t>source · assessment.js:L464  ·  STAGE3_Q2_PAIRS['1-9']</w:t>
       </w:r>
     </w:p>
     <w:p>
@@ -4753,7 +4753,7 @@
           <w:color w:val="7A7A7A"/>
           <w:sz w:val="16"/>
         </w:rPr>
-        <w:t>source · assessment.js:L464  ·  STAGE3_Q2_PAIRS['2-6']</w:t>
+        <w:t>source · assessment.js:L465  ·  STAGE3_Q2_PAIRS['2-6']</w:t>
       </w:r>
     </w:p>
     <w:p>
@@ -4781,7 +4781,7 @@
         <w:t xml:space="preserve">Person A  </w:t>
       </w:r>
       <w:r>
-        <w:t>Feeling disconnected or unappreciated by people who matter to me, like my presence doesn’t make a difference to them.</w:t>
+        <w:t>Feeling disconnected or unappreciated by people who matter to me, like my help doesn’t make a difference to them.</w:t>
       </w:r>
     </w:p>
     <w:p>
@@ -4809,7 +4809,7 @@
           <w:color w:val="7A7A7A"/>
           <w:sz w:val="16"/>
         </w:rPr>
-        <w:t>source · assessment.js:L465  ·  STAGE3_Q2_PAIRS['2-9']</w:t>
+        <w:t>source · assessment.js:L466  ·  STAGE3_Q2_PAIRS['2-9']</w:t>
       </w:r>
     </w:p>
     <w:p>
@@ -4865,7 +4865,7 @@
           <w:color w:val="7A7A7A"/>
           <w:sz w:val="16"/>
         </w:rPr>
-        <w:t>source · assessment.js:L466  ·  STAGE3_Q2_PAIRS['3-7']</w:t>
+        <w:t>source · assessment.js:L467  ·  STAGE3_Q2_PAIRS['3-7']</w:t>
       </w:r>
     </w:p>
     <w:p>
@@ -4921,7 +4921,7 @@
           <w:color w:val="7A7A7A"/>
           <w:sz w:val="16"/>
         </w:rPr>
-        <w:t>source · assessment.js:L467  ·  STAGE3_Q2_PAIRS['3-8']</w:t>
+        <w:t>source · assessment.js:L468  ·  STAGE3_Q2_PAIRS['3-8']</w:t>
       </w:r>
     </w:p>
     <w:p>
@@ -4977,7 +4977,7 @@
           <w:color w:val="7A7A7A"/>
           <w:sz w:val="16"/>
         </w:rPr>
-        <w:t>source · assessment.js:L468  ·  STAGE3_Q2_PAIRS['4-5']</w:t>
+        <w:t>source · assessment.js:L469  ·  STAGE3_Q2_PAIRS['4-5']</w:t>
       </w:r>
     </w:p>
     <w:p>
@@ -5033,7 +5033,7 @@
           <w:color w:val="7A7A7A"/>
           <w:sz w:val="16"/>
         </w:rPr>
-        <w:t>source · assessment.js:L469  ·  STAGE3_Q2_PAIRS['4-9']</w:t>
+        <w:t>source · assessment.js:L470  ·  STAGE3_Q2_PAIRS['4-9']</w:t>
       </w:r>
     </w:p>
     <w:p>
@@ -5076,7 +5076,7 @@
         <w:t xml:space="preserve">Person B  </w:t>
       </w:r>
       <w:r>
-        <w:t>Feeling pressured to assert myself or take a strong position. When there’s conflict or expectation, I find it easier to go along or disengage than to push back.</w:t>
+        <w:t>Feeling pressured to assert myself or take a strong position. When there’s potential conflict, I find it easier to go along or disengage than to push back.</w:t>
       </w:r>
     </w:p>
     <w:p>
@@ -5089,7 +5089,7 @@
           <w:color w:val="7A7A7A"/>
           <w:sz w:val="16"/>
         </w:rPr>
-        <w:t>source · assessment.js:L470  ·  STAGE3_Q2_PAIRS['5-9']</w:t>
+        <w:t>source · assessment.js:L471  ·  STAGE3_Q2_PAIRS['5-9']</w:t>
       </w:r>
     </w:p>
     <w:p>
@@ -5145,7 +5145,7 @@
           <w:color w:val="7A7A7A"/>
           <w:sz w:val="16"/>
         </w:rPr>
-        <w:t>source · assessment.js:L471  ·  STAGE3_Q2_PAIRS['6-8']</w:t>
+        <w:t>source · assessment.js:L472  ·  STAGE3_Q2_PAIRS['6-8']</w:t>
       </w:r>
     </w:p>
     <w:p>
@@ -5201,7 +5201,7 @@
           <w:color w:val="7A7A7A"/>
           <w:sz w:val="16"/>
         </w:rPr>
-        <w:t>source · assessment.js:L473  ·  STAGE3_Q2_PAIRS['1-2']</w:t>
+        <w:t>source · assessment.js:L474  ·  STAGE3_Q2_PAIRS['1-2']</w:t>
       </w:r>
     </w:p>
     <w:p>
@@ -5257,7 +5257,7 @@
           <w:color w:val="7A7A7A"/>
           <w:sz w:val="16"/>
         </w:rPr>
-        <w:t>source · assessment.js:L474  ·  STAGE3_Q2_PAIRS['2-3']</w:t>
+        <w:t>source · assessment.js:L475  ·  STAGE3_Q2_PAIRS['2-3']</w:t>
       </w:r>
     </w:p>
     <w:p>
@@ -5313,7 +5313,7 @@
           <w:color w:val="7A7A7A"/>
           <w:sz w:val="16"/>
         </w:rPr>
-        <w:t>source · assessment.js:L475  ·  STAGE3_Q2_PAIRS['3-4']</w:t>
+        <w:t>source · assessment.js:L476  ·  STAGE3_Q2_PAIRS['3-4']</w:t>
       </w:r>
     </w:p>
     <w:p>
@@ -5369,7 +5369,7 @@
           <w:color w:val="7A7A7A"/>
           <w:sz w:val="16"/>
         </w:rPr>
-        <w:t>source · assessment.js:L476  ·  STAGE3_Q2_PAIRS['5-6']</w:t>
+        <w:t>source · assessment.js:L477  ·  STAGE3_Q2_PAIRS['5-6']</w:t>
       </w:r>
     </w:p>
     <w:p>
@@ -5425,7 +5425,7 @@
           <w:color w:val="7A7A7A"/>
           <w:sz w:val="16"/>
         </w:rPr>
-        <w:t>source · assessment.js:L477  ·  STAGE3_Q2_PAIRS['6-7']</w:t>
+        <w:t>source · assessment.js:L478  ·  STAGE3_Q2_PAIRS['6-7']</w:t>
       </w:r>
     </w:p>
     <w:p>
@@ -5481,7 +5481,7 @@
           <w:color w:val="7A7A7A"/>
           <w:sz w:val="16"/>
         </w:rPr>
-        <w:t>source · assessment.js:L478  ·  STAGE3_Q2_PAIRS['7-8']</w:t>
+        <w:t>source · assessment.js:L479  ·  STAGE3_Q2_PAIRS['7-8']</w:t>
       </w:r>
     </w:p>
     <w:p>
@@ -5537,7 +5537,7 @@
           <w:color w:val="7A7A7A"/>
           <w:sz w:val="16"/>
         </w:rPr>
-        <w:t>source · assessment.js:L479  ·  STAGE3_Q2_PAIRS['8-9']</w:t>
+        <w:t>source · assessment.js:L480  ·  STAGE3_Q2_PAIRS['8-9']</w:t>
       </w:r>
     </w:p>
     <w:p>
@@ -5593,7 +5593,7 @@
           <w:color w:val="7A7A7A"/>
           <w:sz w:val="16"/>
         </w:rPr>
-        <w:t>source · assessment.js:L481  ·  STAGE3_Q2_PAIRS['1-4']</w:t>
+        <w:t>source · assessment.js:L482  ·  STAGE3_Q2_PAIRS['1-4']</w:t>
       </w:r>
     </w:p>
     <w:p>
@@ -5649,7 +5649,7 @@
           <w:color w:val="7A7A7A"/>
           <w:sz w:val="16"/>
         </w:rPr>
-        <w:t>source · assessment.js:L482  ·  STAGE3_Q2_PAIRS['1-7']</w:t>
+        <w:t>source · assessment.js:L483  ·  STAGE3_Q2_PAIRS['1-7']</w:t>
       </w:r>
     </w:p>
     <w:p>
@@ -5705,7 +5705,7 @@
           <w:color w:val="7A7A7A"/>
           <w:sz w:val="16"/>
         </w:rPr>
-        <w:t>source · assessment.js:L483  ·  STAGE3_Q2_PAIRS['2-4']</w:t>
+        <w:t>source · assessment.js:L484  ·  STAGE3_Q2_PAIRS['2-4']</w:t>
       </w:r>
     </w:p>
     <w:p>
@@ -5748,7 +5748,7 @@
         <w:t xml:space="preserve">Person B  </w:t>
       </w:r>
       <w:r>
-        <w:t>Being put in a position where someone else holds power over me. I’d far rather take charge than risk being dependent or controlled.</w:t>
+        <w:t>Being put in a position where someone else holds power over me. I’d much rather take charge than risk being dependent or controlled.</w:t>
       </w:r>
     </w:p>
     <w:p>
@@ -5761,7 +5761,7 @@
           <w:color w:val="7A7A7A"/>
           <w:sz w:val="16"/>
         </w:rPr>
-        <w:t>source · assessment.js:L484  ·  STAGE3_Q2_PAIRS['2-8']</w:t>
+        <w:t>source · assessment.js:L485  ·  STAGE3_Q2_PAIRS['2-8']</w:t>
       </w:r>
     </w:p>
     <w:p>
@@ -5817,7 +5817,7 @@
           <w:color w:val="7A7A7A"/>
           <w:sz w:val="16"/>
         </w:rPr>
-        <w:t>source · assessment.js:L485  ·  STAGE3_Q2_PAIRS['3-6']</w:t>
+        <w:t>source · assessment.js:L486  ·  STAGE3_Q2_PAIRS['3-6']</w:t>
       </w:r>
     </w:p>
     <w:p>
@@ -5873,7 +5873,7 @@
           <w:color w:val="7A7A7A"/>
           <w:sz w:val="16"/>
         </w:rPr>
-        <w:t>source · assessment.js:L486  ·  STAGE3_Q2_PAIRS['3-9']</w:t>
+        <w:t>source · assessment.js:L487  ·  STAGE3_Q2_PAIRS['3-9']</w:t>
       </w:r>
     </w:p>
     <w:p>
@@ -5901,7 +5901,7 @@
         <w:t xml:space="preserve">Person A  </w:t>
       </w:r>
       <w:r>
-        <w:t>Having too much asked of me before I’m ready, draining my energy and space. When that happens, I pull back to protect what I have left.</w:t>
+        <w:t>Having too much asked of me before I’m ready, draining my energy. When that happens, I pull back to protect what I have left.</w:t>
       </w:r>
     </w:p>
     <w:p>
@@ -5929,7 +5929,7 @@
           <w:color w:val="7A7A7A"/>
           <w:sz w:val="16"/>
         </w:rPr>
-        <w:t>source · assessment.js:L487  ·  STAGE3_Q2_PAIRS['5-7']</w:t>
+        <w:t>source · assessment.js:L488  ·  STAGE3_Q2_PAIRS['5-7']</w:t>
       </w:r>
     </w:p>
     <w:p>
@@ -5957,7 +5957,7 @@
         <w:t xml:space="preserve">Person A  </w:t>
       </w:r>
       <w:r>
-        <w:t>Being intruded upon, or having more asked of me than I can give. My instinct is to withdraw and make myself small until I feel ready.</w:t>
+        <w:t>Being intruded upon, or having more asked of me than I can give. My instinct is to withdraw until I feel ready to connect.</w:t>
       </w:r>
     </w:p>
     <w:p>
@@ -5985,7 +5985,7 @@
           <w:color w:val="7A7A7A"/>
           <w:sz w:val="16"/>
         </w:rPr>
-        <w:t>source · assessment.js:L488  ·  STAGE3_Q2_PAIRS['5-8']</w:t>
+        <w:t>source · assessment.js:L489  ·  STAGE3_Q2_PAIRS['5-8']</w:t>
       </w:r>
     </w:p>
     <w:p>
@@ -6041,7 +6041,7 @@
           <w:color w:val="7A7A7A"/>
           <w:sz w:val="16"/>
         </w:rPr>
-        <w:t>source · assessment.js:L489  ·  STAGE3_Q2_PAIRS['6-9']</w:t>
+        <w:t>source · assessment.js:L490  ·  STAGE3_Q2_PAIRS['6-9']</w:t>
       </w:r>
     </w:p>
     <w:p>
@@ -6118,7 +6118,7 @@
         <w:t xml:space="preserve">Person B  </w:t>
       </w:r>
       <w:r>
-        <w:t>(lookalike, Type 2) I am tuned in to what others need. I feel genuinely helpful, warm, and deeply connected, and I need to feel that my presence matters to them.</w:t>
+        <w:t>(lookalike, Type 2) I am tuned in to what others need. I feel genuinely helpful, warm, and deeply connected, and I need to feel that my help matters to them.</w:t>
       </w:r>
     </w:p>
     <w:p>
@@ -6131,7 +6131,7 @@
           <w:color w:val="7A7A7A"/>
           <w:sz w:val="16"/>
         </w:rPr>
-        <w:t>source · assessment.js:L497  ·  STAGE3_CT_COMPARATIVES['SO-7']</w:t>
+        <w:t>source · assessment.js:L498  ·  STAGE3_CT_COMPARATIVES['SO-7']</w:t>
       </w:r>
     </w:p>
     <w:p>
@@ -6198,7 +6198,7 @@
           <w:color w:val="7A7A7A"/>
           <w:sz w:val="16"/>
         </w:rPr>
-        <w:t>source · assessment.js:L498  ·  STAGE3_CT_COMPARATIVES['SX-6']</w:t>
+        <w:t>source · assessment.js:L499  ·  STAGE3_CT_COMPARATIVES['SX-6']</w:t>
       </w:r>
     </w:p>
     <w:p>
@@ -6237,7 +6237,7 @@
         <w:t xml:space="preserve">Person A  </w:t>
       </w:r>
       <w:r>
-        <w:t>(counter-type, Type 3) I am getting things done and building something solid. I feel capable and self-sufficient, and I don’t need recognition, just to know I’ve made it on my own terms.</w:t>
+        <w:t>(counter-type, Type 3) I am getting things done and building something solid. I feel capable and self-sufficient, and I don’t need recognition. It is enough for me to know I’ve made it on my own terms.</w:t>
       </w:r>
     </w:p>
     <w:p>
@@ -6265,7 +6265,7 @@
           <w:color w:val="7A7A7A"/>
           <w:sz w:val="16"/>
         </w:rPr>
-        <w:t>source · assessment.js:L499  ·  STAGE3_CT_COMPARATIVES['SP-3']</w:t>
+        <w:t>source · assessment.js:L500  ·  STAGE3_CT_COMPARATIVES['SP-3']</w:t>
       </w:r>
     </w:p>
     <w:p>
@@ -6304,7 +6304,7 @@
         <w:t xml:space="preserve">Person A  </w:t>
       </w:r>
       <w:r>
-        <w:t>(counter-type, Type 4) I am proving something, to myself more than anyone else. I feel driven and resilient, like I’m refusing to be defeated by a sense of not being enough.</w:t>
+        <w:t>(counter-type, Type 4) I am proving something to myself more than anyone else. I feel driven and resilient, like I’m refusing to be defeated by a sense of not being enough.</w:t>
       </w:r>
     </w:p>
     <w:p>
@@ -6332,7 +6332,7 @@
           <w:color w:val="7A7A7A"/>
           <w:sz w:val="16"/>
         </w:rPr>
-        <w:t>source · assessment.js:L500  ·  STAGE3_CT_COMPARATIVES['SP-4']</w:t>
+        <w:t>source · assessment.js:L501  ·  STAGE3_CT_COMPARATIVES['SP-4']</w:t>
       </w:r>
     </w:p>
     <w:p>
@@ -6371,7 +6371,7 @@
         <w:t xml:space="preserve">Person A  </w:t>
       </w:r>
       <w:r>
-        <w:t>(counter-type, Type 1) I am fighting for something that genuinely matters. I feel intensely alive when I’m up against something wrong, with a standard at stake I won’t back down from.</w:t>
+        <w:t>(counter-type, Type 1) I am fighting for something that genuinely matters. I feel intensely alive when I’m up against something wrong, with a standard at stake that I won’t back down from.</w:t>
       </w:r>
     </w:p>
     <w:p>
@@ -6399,7 +6399,7 @@
           <w:color w:val="7A7A7A"/>
           <w:sz w:val="16"/>
         </w:rPr>
-        <w:t>source · assessment.js:L501  ·  STAGE3_CT_COMPARATIVES['SX-1']</w:t>
+        <w:t>source · assessment.js:L502  ·  STAGE3_CT_COMPARATIVES['SX-1']</w:t>
       </w:r>
     </w:p>
     <w:p/>
@@ -6471,7 +6471,7 @@
           <w:color w:val="7A7A7A"/>
           <w:sz w:val="16"/>
         </w:rPr>
-        <w:t>source · assessment.js:L530  ·  STAGE4_STRESS_STEM</w:t>
+        <w:t>source · assessment.js:L531  ·  STAGE4_STRESS_STEM</w:t>
       </w:r>
     </w:p>
     <w:p>
@@ -6508,7 +6508,7 @@
           <w:color w:val="7A7A7A"/>
           <w:sz w:val="16"/>
         </w:rPr>
-        <w:t>source · assessment.js:L531  ·  STAGE4_SECURITY_STEM</w:t>
+        <w:t>source · assessment.js:L532  ·  STAGE4_SECURITY_STEM</w:t>
       </w:r>
     </w:p>
     <w:p>
@@ -6545,7 +6545,7 @@
           <w:color w:val="7A7A7A"/>
           <w:sz w:val="16"/>
         </w:rPr>
-        <w:t>source · assessment.js:L532  ·  STAGE4_HABIT_STEM</w:t>
+        <w:t>source · assessment.js:L533  ·  STAGE4_HABIT_STEM</w:t>
       </w:r>
     </w:p>
     <w:p>
@@ -6659,7 +6659,7 @@
         <w:t xml:space="preserve">Correct (canonical)  </w:t>
       </w:r>
       <w:r>
-        <w:t>I become weighed down with emotion. I start dwelling on what others have naturally that I don’t and I long to be whole.</w:t>
+        <w:t>I become weighed down with sadness. I start dwelling on what others have naturally that I don’t and I long to be whole.</w:t>
       </w:r>
     </w:p>
     <w:p>
@@ -6674,7 +6674,7 @@
         <w:t xml:space="preserve">Distractor (alt1)  </w:t>
       </w:r>
       <w:r>
-        <w:t>I become more anxious and suspicious. I start worrying about what could go wrong and need reassurance that things will be okay.</w:t>
+        <w:t>I throw myself into achieving something. I push distractions aside, focus on what I can accomplish, and measure my worth by what I can visibly produce.</w:t>
       </w:r>
     </w:p>
     <w:p>
@@ -6702,7 +6702,7 @@
           <w:color w:val="7A7A7A"/>
           <w:sz w:val="16"/>
         </w:rPr>
-        <w:t>source · assessment.js:L541  ·  STAGE4_STRESS</w:t>
+        <w:t>source · assessment.js:L542  ·  STAGE4_STRESS</w:t>
       </w:r>
     </w:p>
     <w:p>
@@ -6760,7 +6760,7 @@
         <w:t xml:space="preserve">Distractor (alt2)  </w:t>
       </w:r>
       <w:r>
-        <w:t>I turn inward and become absorbed in how I’m feeling. I pull away from others and get lost in my own emotional world.</w:t>
+        <w:t>I detach and go quiet. I stop engaging with people’s needs entirely and retreat into my own head, needing to think things through on my own before I can face anyone.</w:t>
       </w:r>
     </w:p>
     <w:p>
@@ -6773,7 +6773,7 @@
           <w:color w:val="7A7A7A"/>
           <w:sz w:val="16"/>
         </w:rPr>
-        <w:t>source · assessment.js:L546  ·  STAGE4_STRESS</w:t>
+        <w:t>source · assessment.js:L547  ·  STAGE4_STRESS</w:t>
       </w:r>
     </w:p>
     <w:p>
@@ -6801,7 +6801,7 @@
         <w:t xml:space="preserve">Correct (canonical)  </w:t>
       </w:r>
       <w:r>
-        <w:t>I shut down. The drive and ambition that usually feel effortless just vanish and I find myself checked out and disengaged.</w:t>
+        <w:t>I shut down. The drive and ambition that usually feel effortless vanish and I find myself checked out and disengaged.</w:t>
       </w:r>
     </w:p>
     <w:p>
@@ -6816,7 +6816,7 @@
         <w:t xml:space="preserve">Distractor (alt1)  </w:t>
       </w:r>
       <w:r>
-        <w:t>I become anxious and start second-guessing myself. I lose confidence in my own judgment and need others to tell me I’m on the right track.</w:t>
+        <w:t>I lose focus and start jumping between things. Nothing holds my attention and I find myself chasing whatever feels stimulating, unable to settle on any one thing.</w:t>
       </w:r>
     </w:p>
     <w:p>
@@ -6831,7 +6831,7 @@
         <w:t xml:space="preserve">Distractor (alt2)  </w:t>
       </w:r>
       <w:r>
-        <w:t>I become overly focused on others and what they need. I shift into caretaking mode as a way to feel needed and connected.</w:t>
+        <w:t>I become combative and start pushing hard. I stop being strategic about how I come across and just start forcing things, needing to feel like I’m in control of something.</w:t>
       </w:r>
     </w:p>
     <w:p>
@@ -6844,7 +6844,7 @@
           <w:color w:val="7A7A7A"/>
           <w:sz w:val="16"/>
         </w:rPr>
-        <w:t>source · assessment.js:L551  ·  STAGE4_STRESS</w:t>
+        <w:t>source · assessment.js:L552  ·  STAGE4_STRESS</w:t>
       </w:r>
     </w:p>
     <w:p>
@@ -6887,7 +6887,7 @@
         <w:t xml:space="preserve">Distractor (alt1)  </w:t>
       </w:r>
       <w:r>
-        <w:t>I become self-critical and rigid. I get fixated on what I’ve done wrong and feel a strong pull to correct myself.</w:t>
+        <w:t>I become hypervigilant and start looking for what could go wrong. I get caught up in worst-case scenarios and find myself needing to know that things are going to be okay.</w:t>
       </w:r>
     </w:p>
     <w:p>
@@ -6915,7 +6915,7 @@
           <w:color w:val="7A7A7A"/>
           <w:sz w:val="16"/>
         </w:rPr>
-        <w:t>source · assessment.js:L556  ·  STAGE4_STRESS</w:t>
+        <w:t>source · assessment.js:L557  ·  STAGE4_STRESS</w:t>
       </w:r>
     </w:p>
     <w:p>
@@ -6958,7 +6958,7 @@
         <w:t xml:space="preserve">Distractor (alt1)  </w:t>
       </w:r>
       <w:r>
-        <w:t>I become reactive and forceful. I lose my usual calm detachment and feel an intense need to push back and take control.</w:t>
+        <w:t>I become preoccupied with how others are doing. I find myself checking in, offering help, and seeking connection — almost as if staying close to people will quiet something that’s unsettled inside me.</w:t>
       </w:r>
     </w:p>
     <w:p>
@@ -6973,7 +6973,7 @@
         <w:t xml:space="preserve">Distractor (alt2)  </w:t>
       </w:r>
       <w:r>
-        <w:t>I become more anxious and catastrophizing. I lose my objective detachment and start spiraling into what could go wrong.</w:t>
+        <w:t>I go foggy and check out. I lose my own thread entirely, drift into whatever’s easiest, and stop being able to tell what I actually think.</w:t>
       </w:r>
     </w:p>
     <w:p>
@@ -6986,7 +6986,7 @@
           <w:color w:val="7A7A7A"/>
           <w:sz w:val="16"/>
         </w:rPr>
-        <w:t>source · assessment.js:L561  ·  STAGE4_STRESS</w:t>
+        <w:t>source · assessment.js:L562  ·  STAGE4_STRESS</w:t>
       </w:r>
     </w:p>
     <w:p>
@@ -7029,7 +7029,7 @@
         <w:t xml:space="preserve">Distractor (alt1)  </w:t>
       </w:r>
       <w:r>
-        <w:t>I become forceful and combative. I stop hesitating and start pushing hard — I need to feel powerful and in control.</w:t>
+        <w:t>I become domineering and start bulldozing through things. I stop second-guessing and just act — needing to feel like I’m the one calling the shots.</w:t>
       </w:r>
     </w:p>
     <w:p>
@@ -7044,7 +7044,7 @@
         <w:t xml:space="preserve">Distractor (alt2)  </w:t>
       </w:r>
       <w:r>
-        <w:t>I check out and go numb. I stop engaging with the anxiety and just try to get through it by not feeling anything.</w:t>
+        <w:t>I become rigid and critical, fixating on everything that isn’t being done correctly and feeling a hard edge of irritation when it isn’t.</w:t>
       </w:r>
     </w:p>
     <w:p>
@@ -7057,7 +7057,7 @@
           <w:color w:val="7A7A7A"/>
           <w:sz w:val="16"/>
         </w:rPr>
-        <w:t>source · assessment.js:L566  ·  STAGE4_STRESS</w:t>
+        <w:t>source · assessment.js:L567  ·  STAGE4_STRESS</w:t>
       </w:r>
     </w:p>
     <w:p>
@@ -7115,7 +7115,7 @@
         <w:t xml:space="preserve">Distractor (alt2)  </w:t>
       </w:r>
       <w:r>
-        <w:t>I withdraw and go quiet. I stop engaging and start retreating into my own world, needing a lot of alone time to recover.</w:t>
+        <w:t>I become preoccupied with keeping everyone around me happy. I throw myself into smoothing things over and meeting others’ needs, anxious about the connections feeling shaky.</w:t>
       </w:r>
     </w:p>
     <w:p>
@@ -7128,7 +7128,7 @@
           <w:color w:val="7A7A7A"/>
           <w:sz w:val="16"/>
         </w:rPr>
-        <w:t>source · assessment.js:L571  ·  STAGE4_STRESS</w:t>
+        <w:t>source · assessment.js:L572  ·  STAGE4_STRESS</w:t>
       </w:r>
     </w:p>
     <w:p>
@@ -7171,7 +7171,7 @@
         <w:t xml:space="preserve">Distractor (alt1)  </w:t>
       </w:r>
       <w:r>
-        <w:t>I become more giving and focused on others. I move toward people and shift into support mode, wanting to feel needed.</w:t>
+        <w:t>I sink into my own feelings and pull away. I get caught up in a sense that something’s missing or that I’ve been let down, and I dwell on it more than I’d like to admit.</w:t>
       </w:r>
     </w:p>
     <w:p>
@@ -7186,7 +7186,7 @@
         <w:t xml:space="preserve">Distractor (alt2)  </w:t>
       </w:r>
       <w:r>
-        <w:t>I become more driven and performance-focused. I push myself harder to stay productive and appear capable under pressure.</w:t>
+        <w:t>I lose my certainty and start second-guessing every move. I hesitate, look for input before acting, and feel uneasy committing to a decision on my own.</w:t>
       </w:r>
     </w:p>
     <w:p>
@@ -7199,7 +7199,7 @@
           <w:color w:val="7A7A7A"/>
           <w:sz w:val="16"/>
         </w:rPr>
-        <w:t>source · assessment.js:L576  ·  STAGE4_STRESS</w:t>
+        <w:t>source · assessment.js:L577  ·  STAGE4_STRESS</w:t>
       </w:r>
     </w:p>
     <w:p>
@@ -7242,7 +7242,7 @@
         <w:t xml:space="preserve">Distractor (alt1)  </w:t>
       </w:r>
       <w:r>
-        <w:t>I become emotionally flooded and withdrawn. I get absorbed in my feelings and pull away from people and obligations.</w:t>
+        <w:t>I get analytical and detached. I start dissecting the problem from a distance, wanting to understand exactly how it works before I’ll let myself act.</w:t>
       </w:r>
     </w:p>
     <w:p>
@@ -7257,7 +7257,7 @@
         <w:t xml:space="preserve">Distractor (alt2)  </w:t>
       </w:r>
       <w:r>
-        <w:t>I become driven and task-focused. I throw myself into productivity to avoid feeling what’s happening under the surface.</w:t>
+        <w:t>I quickly reframe everything in a positive light and start brainstorming options. I get excited about all the ways things could work out and want to keep my choices open.</w:t>
       </w:r>
     </w:p>
     <w:p>
@@ -7270,7 +7270,7 @@
           <w:color w:val="7A7A7A"/>
           <w:sz w:val="16"/>
         </w:rPr>
-        <w:t>source · assessment.js:L581  ·  STAGE4_STRESS</w:t>
+        <w:t>source · assessment.js:L582  ·  STAGE4_STRESS</w:t>
       </w:r>
     </w:p>
     <w:p>
@@ -7336,7 +7336,7 @@
         <w:t xml:space="preserve">Distractor (alt1)  </w:t>
       </w:r>
       <w:r>
-        <w:t>I become warmer and more focused on others. I want to give more and feel more connected to the people I care about.</w:t>
+        <w:t>I feel powerful and ready to take charge. Nothing intimidates me — I push forward hard, take up space, and make things happen on my terms.</w:t>
       </w:r>
     </w:p>
     <w:p>
@@ -7364,7 +7364,7 @@
           <w:color w:val="7A7A7A"/>
           <w:sz w:val="16"/>
         </w:rPr>
-        <w:t>source · assessment.js:L589  ·  STAGE4_SECURITY</w:t>
+        <w:t>source · assessment.js:L590  ·  STAGE4_SECURITY</w:t>
       </w:r>
     </w:p>
     <w:p>
@@ -7407,7 +7407,7 @@
         <w:t xml:space="preserve">Distractor (alt1)  </w:t>
       </w:r>
       <w:r>
-        <w:t>I become easier to be around and less agenda-driven. I stop pushing so hard to be needed and let myself just relax and enjoy things.</w:t>
+        <w:t>I become more self-contained and reflective. I step back, conserve my energy, and feel content with my own company.</w:t>
       </w:r>
     </w:p>
     <w:p>
@@ -7435,7 +7435,7 @@
           <w:color w:val="7A7A7A"/>
           <w:sz w:val="16"/>
         </w:rPr>
-        <w:t>source · assessment.js:L594  ·  STAGE4_SECURITY</w:t>
+        <w:t>source · assessment.js:L595  ·  STAGE4_SECURITY</w:t>
       </w:r>
     </w:p>
     <w:p>
@@ -7478,7 +7478,7 @@
         <w:t xml:space="preserve">Distractor (alt1)  </w:t>
       </w:r>
       <w:r>
-        <w:t>I slow down and become more easygoing. I stop needing to achieve and just let myself be present without an agenda.</w:t>
+        <w:t>I get more direct and unfiltered. I stop managing how I come across and just say what I really think, without worrying about the impression I’m making.</w:t>
       </w:r>
     </w:p>
     <w:p>
@@ -7493,7 +7493,7 @@
         <w:t xml:space="preserve">Distractor (alt2)  </w:t>
       </w:r>
       <w:r>
-        <w:t>I become more spontaneous and curious. I stop focusing on goals and let myself just explore and enjoy what’s in front of me.</w:t>
+        <w:t>I become more self-contained and clear-headed. I stop performing and step back to think things through on my own, content without the audience.</w:t>
       </w:r>
     </w:p>
     <w:p>
@@ -7506,7 +7506,7 @@
           <w:color w:val="7A7A7A"/>
           <w:sz w:val="16"/>
         </w:rPr>
-        <w:t>source · assessment.js:L599  ·  STAGE4_SECURITY</w:t>
+        <w:t>source · assessment.js:L600  ·  STAGE4_SECURITY</w:t>
       </w:r>
     </w:p>
     <w:p>
@@ -7564,7 +7564,7 @@
         <w:t xml:space="preserve">Distractor (alt2)  </w:t>
       </w:r>
       <w:r>
-        <w:t>I become more outward-focused and giving. I stop dwelling on myself and feel genuinely energized by helping and connecting with others.</w:t>
+        <w:t>I become more at peace and accepting. The longing quiets down and I settle into an easy contentment with things just as they are.</w:t>
       </w:r>
     </w:p>
     <w:p>
@@ -7577,7 +7577,7 @@
           <w:color w:val="7A7A7A"/>
           <w:sz w:val="16"/>
         </w:rPr>
-        <w:t>source · assessment.js:L604  ·  STAGE4_SECURITY</w:t>
+        <w:t>source · assessment.js:L605  ·  STAGE4_SECURITY</w:t>
       </w:r>
     </w:p>
     <w:p>
@@ -7648,7 +7648,7 @@
           <w:color w:val="7A7A7A"/>
           <w:sz w:val="16"/>
         </w:rPr>
-        <w:t>source · assessment.js:L609  ·  STAGE4_SECURITY</w:t>
+        <w:t>source · assessment.js:L610  ·  STAGE4_SECURITY</w:t>
       </w:r>
     </w:p>
     <w:p>
@@ -7719,7 +7719,7 @@
           <w:color w:val="7A7A7A"/>
           <w:sz w:val="16"/>
         </w:rPr>
-        <w:t>source · assessment.js:L614  ·  STAGE4_SECURITY</w:t>
+        <w:t>source · assessment.js:L615  ·  STAGE4_SECURITY</w:t>
       </w:r>
     </w:p>
     <w:p>
@@ -7762,7 +7762,7 @@
         <w:t xml:space="preserve">Distractor (alt1)  </w:t>
       </w:r>
       <w:r>
-        <w:t>I become more easygoing and present. I stop planning ahead and let myself just be where I am without needing something else to be happening.</w:t>
+        <w:t>I become more attuned to the people around me. My energy shifts toward caring for others and I feel fulfilled by making them feel seen and supported.</w:t>
       </w:r>
     </w:p>
     <w:p>
@@ -7790,7 +7790,7 @@
           <w:color w:val="7A7A7A"/>
           <w:sz w:val="16"/>
         </w:rPr>
-        <w:t>source · assessment.js:L619  ·  STAGE4_SECURITY</w:t>
+        <w:t>source · assessment.js:L620  ·  STAGE4_SECURITY</w:t>
       </w:r>
     </w:p>
     <w:p>
@@ -7861,7 +7861,7 @@
           <w:color w:val="7A7A7A"/>
           <w:sz w:val="16"/>
         </w:rPr>
-        <w:t>source · assessment.js:L624  ·  STAGE4_SECURITY</w:t>
+        <w:t>source · assessment.js:L625  ·  STAGE4_SECURITY</w:t>
       </w:r>
     </w:p>
     <w:p>
@@ -7919,7 +7919,7 @@
         <w:t xml:space="preserve">Distractor (alt2)  </w:t>
       </w:r>
       <w:r>
-        <w:t>I become warmer and more attuned. I feel a pull toward the people around me and genuinely enjoy caring for them.</w:t>
+        <w:t>I become more principled and discerning. I get clearer about what actually matters to me and hold a firmer line on it.</w:t>
       </w:r>
     </w:p>
     <w:p>
@@ -7932,7 +7932,7 @@
           <w:color w:val="7A7A7A"/>
           <w:sz w:val="16"/>
         </w:rPr>
-        <w:t>source · assessment.js:L629  ·  STAGE4_SECURITY</w:t>
+        <w:t>source · assessment.js:L630  ·  STAGE4_SECURITY</w:t>
       </w:r>
     </w:p>
     <w:p>
@@ -7998,7 +7998,7 @@
         <w:t xml:space="preserve">Distractor (alt1)  </w:t>
       </w:r>
       <w:r>
-        <w:t>To what could go wrong or what I might not be prepared for. I’m scanning for potential problems and threats before they materialize.</w:t>
+        <w:t>To what’s absent and the longing it stirs — a sense that something deeper or more meaningful is missing from this.</w:t>
       </w:r>
     </w:p>
     <w:p>
@@ -8026,7 +8026,7 @@
           <w:color w:val="7A7A7A"/>
           <w:sz w:val="16"/>
         </w:rPr>
-        <w:t>source · assessment.js:L637  ·  STAGE4_HABIT</w:t>
+        <w:t>source · assessment.js:L638  ·  STAGE4_HABIT</w:t>
       </w:r>
     </w:p>
     <w:p>
@@ -8069,7 +8069,7 @@
         <w:t xml:space="preserve">Distractor (alt1)  </w:t>
       </w:r>
       <w:r>
-        <w:t>To the overall atmosphere and whether everyone feels comfortable. I’m aware of the group energy and pulled toward making sure things feel settled.</w:t>
+        <w:t>To gathering information and understanding how things work. I’m observing from a step back, taking in data and figuring out the underlying logic.</w:t>
       </w:r>
     </w:p>
     <w:p>
@@ -8097,7 +8097,7 @@
           <w:color w:val="7A7A7A"/>
           <w:sz w:val="16"/>
         </w:rPr>
-        <w:t>source · assessment.js:L642  ·  STAGE4_HABIT</w:t>
+        <w:t>source · assessment.js:L643  ·  STAGE4_HABIT</w:t>
       </w:r>
     </w:p>
     <w:p>
@@ -8168,7 +8168,7 @@
           <w:color w:val="7A7A7A"/>
           <w:sz w:val="16"/>
         </w:rPr>
-        <w:t>source · assessment.js:L647  ·  STAGE4_HABIT</w:t>
+        <w:t>source · assessment.js:L648  ·  STAGE4_HABIT</w:t>
       </w:r>
     </w:p>
     <w:p>
@@ -8239,7 +8239,7 @@
           <w:color w:val="7A7A7A"/>
           <w:sz w:val="16"/>
         </w:rPr>
-        <w:t>source · assessment.js:L652  ·  STAGE4_HABIT</w:t>
+        <w:t>source · assessment.js:L653  ·  STAGE4_HABIT</w:t>
       </w:r>
     </w:p>
     <w:p>
@@ -8282,7 +8282,7 @@
         <w:t xml:space="preserve">Distractor (alt1)  </w:t>
       </w:r>
       <w:r>
-        <w:t>To what could go wrong and whether I’m prepared. I find myself anticipating problems and wanting to have a plan before I’m in over my head.</w:t>
+        <w:t>To who has the upper hand and how much force is in play. I size people up fast — strong or weak, straight or evasive — and brace to assert myself if I need to.</w:t>
       </w:r>
     </w:p>
     <w:p>
@@ -8310,7 +8310,7 @@
           <w:color w:val="7A7A7A"/>
           <w:sz w:val="16"/>
         </w:rPr>
-        <w:t>source · assessment.js:L657  ·  STAGE4_HABIT</w:t>
+        <w:t>source · assessment.js:L658  ·  STAGE4_HABIT</w:t>
       </w:r>
     </w:p>
     <w:p>
@@ -8353,7 +8353,7 @@
         <w:t xml:space="preserve">Distractor (alt1)  </w:t>
       </w:r>
       <w:r>
-        <w:t>To understanding the situation fully before engaging. I want enough information to feel confident before I commit to anything.</w:t>
+        <w:t>To what’s not right and needs correcting. I notice mistakes and the gap between how things are and how they should be, and I feel pulled to fix it.</w:t>
       </w:r>
     </w:p>
     <w:p>
@@ -8381,7 +8381,7 @@
           <w:color w:val="7A7A7A"/>
           <w:sz w:val="16"/>
         </w:rPr>
-        <w:t>source · assessment.js:L662  ·  STAGE4_HABIT</w:t>
+        <w:t>source · assessment.js:L663  ·  STAGE4_HABIT</w:t>
       </w:r>
     </w:p>
     <w:p>
@@ -8439,7 +8439,7 @@
         <w:t xml:space="preserve">Distractor (alt2)  </w:t>
       </w:r>
       <w:r>
-        <w:t>To the people in the room and what might make this more enjoyable for everyone. I want to create energy and connection.</w:t>
+        <w:t>To what could go wrong and what I’m not prepared for. I’m scanning for problems and potential threats before they have a chance to materialize.</w:t>
       </w:r>
     </w:p>
     <w:p>
@@ -8452,7 +8452,7 @@
           <w:color w:val="7A7A7A"/>
           <w:sz w:val="16"/>
         </w:rPr>
-        <w:t>source · assessment.js:L667  ·  STAGE4_HABIT</w:t>
+        <w:t>source · assessment.js:L668  ·  STAGE4_HABIT</w:t>
       </w:r>
     </w:p>
     <w:p>
@@ -8495,7 +8495,7 @@
         <w:t xml:space="preserve">Distractor (alt1)  </w:t>
       </w:r>
       <w:r>
-        <w:t>To what needs to happen and who’s going to make it happen. I’m assessing quickly and feel a pull to take charge if no one else is.</w:t>
+        <w:t>To gathering information and figuring out how things actually work. I observe from a step back, take in the details, and want to understand the whole picture before I’d weigh in.</w:t>
       </w:r>
     </w:p>
     <w:p>
@@ -8523,7 +8523,7 @@
           <w:color w:val="7A7A7A"/>
           <w:sz w:val="16"/>
         </w:rPr>
-        <w:t>source · assessment.js:L672  ·  STAGE4_HABIT</w:t>
+        <w:t>source · assessment.js:L673  ·  STAGE4_HABIT</w:t>
       </w:r>
     </w:p>
     <w:p>
@@ -8566,7 +8566,7 @@
         <w:t xml:space="preserve">Distractor (alt1)  </w:t>
       </w:r>
       <w:r>
-        <w:t>To who might need something. I notice quickly if someone seems left out or uncomfortable and feel a pull to help.</w:t>
+        <w:t>To what needs to get done and the most efficient way to do it. My mind goes straight to goals, next steps, and making visible progress.</w:t>
       </w:r>
     </w:p>
     <w:p>
@@ -8594,7 +8594,7 @@
           <w:color w:val="7A7A7A"/>
           <w:sz w:val="16"/>
         </w:rPr>
-        <w:t>source · assessment.js:L677  ·  STAGE4_HABIT</w:t>
+        <w:t>source · assessment.js:L678  ·  STAGE4_HABIT</w:t>
       </w:r>
     </w:p>
     <w:p>
@@ -8772,7 +8772,7 @@
           <w:color w:val="7A7A7A"/>
           <w:sz w:val="16"/>
         </w:rPr>
-        <w:t>source · assessment.js:L690  ·  STAGE4_CT_COMPARATIVE['SO-7']</w:t>
+        <w:t>source · assessment.js:L691  ·  STAGE4_CT_COMPARATIVE['SO-7']</w:t>
       </w:r>
     </w:p>
     <w:p>
@@ -8927,7 +8927,7 @@
           <w:color w:val="7A7A7A"/>
           <w:sz w:val="16"/>
         </w:rPr>
-        <w:t>source · assessment.js:L705  ·  STAGE4_CT_COMPARATIVE['SX-6']</w:t>
+        <w:t>source · assessment.js:L706  ·  STAGE4_CT_COMPARATIVE['SX-6']</w:t>
       </w:r>
     </w:p>
     <w:p>
@@ -8968,7 +8968,7 @@
         <w:t xml:space="preserve">Person A  </w:t>
       </w:r>
       <w:r>
-        <w:t>I shut down. The drive and ambition that usually feel effortless just vanish and I find myself checked out and disengaged.</w:t>
+        <w:t>I shut down. The drive and ambition that usually feel effortless vanish and I find myself checked out and disengaged.</w:t>
       </w:r>
     </w:p>
     <w:p>
@@ -8983,7 +8983,7 @@
         <w:t xml:space="preserve">Person B  </w:t>
       </w:r>
       <w:r>
-        <w:t>I become weighed down with emotion. I start dwelling on what others have naturally that I don’t and I long to be whole.</w:t>
+        <w:t>I become weighed down with sadness. I start dwelling on what others have naturally that I don’t and I long to be whole.</w:t>
       </w:r>
     </w:p>
     <w:p>
@@ -9082,7 +9082,7 @@
           <w:color w:val="7A7A7A"/>
           <w:sz w:val="16"/>
         </w:rPr>
-        <w:t>source · assessment.js:L720  ·  STAGE4_CT_COMPARATIVE['SP-3']</w:t>
+        <w:t>source · assessment.js:L721  ·  STAGE4_CT_COMPARATIVE['SP-3']</w:t>
       </w:r>
     </w:p>
     <w:p>
@@ -9138,7 +9138,7 @@
         <w:t xml:space="preserve">Person B  </w:t>
       </w:r>
       <w:r>
-        <w:t>I shut down. The drive and ambition that usually feel effortless just vanish and I find myself checked out and disengaged.</w:t>
+        <w:t>I shut down. The drive and ambition that usually feel effortless vanish and I find myself checked out and disengaged.</w:t>
       </w:r>
     </w:p>
     <w:p>
@@ -9237,7 +9237,7 @@
           <w:color w:val="7A7A7A"/>
           <w:sz w:val="16"/>
         </w:rPr>
-        <w:t>source · assessment.js:L735  ·  STAGE4_CT_COMPARATIVE['SP-4']</w:t>
+        <w:t>source · assessment.js:L736  ·  STAGE4_CT_COMPARATIVE['SP-4']</w:t>
       </w:r>
     </w:p>
     <w:p>
@@ -9278,7 +9278,7 @@
         <w:t xml:space="preserve">Person A  </w:t>
       </w:r>
       <w:r>
-        <w:t>I become weighed down with emotion. I start dwelling on what others have naturally that I don’t and I long to be whole.</w:t>
+        <w:t>I become weighed down with sadness. I start dwelling on what others have naturally that I don’t and I long to be whole.</w:t>
       </w:r>
     </w:p>
     <w:p>
@@ -9321,7 +9321,7 @@
         <w:t xml:space="preserve">Person A  </w:t>
       </w:r>
       <w:r>
-        <w:t>I become more loyal, collaborative, and questioning. I want to check in with people I trust and think things through more carefully, and I feel less need to prove myself.</w:t>
+        <w:t>I become lighter, more playful, and spontaneous. I stop being so hard on myself and find it easier to enjoy things without worrying about doing them perfectly.</w:t>
       </w:r>
     </w:p>
     <w:p>
@@ -9392,7 +9392,7 @@
           <w:color w:val="7A7A7A"/>
           <w:sz w:val="16"/>
         </w:rPr>
-        <w:t>source · assessment.js:L750  ·  STAGE4_CT_COMPARATIVE['SX-1']</w:t>
+        <w:t>source · assessment.js:L751  ·  STAGE4_CT_COMPARATIVE['SX-1']</w:t>
       </w:r>
     </w:p>
     <w:p/>
@@ -9440,7 +9440,7 @@
         <w:rPr>
           <w:sz w:val="21"/>
         </w:rPr>
-        <w:t>Is there anything about what drives you that those statements didn’t capture? (Optional)</w:t>
+        <w:t>Our core motivations are often hard to pin down. If there’s something about what drives you that the previous statements didn’t capture, add it here.</w:t>
       </w:r>
     </w:p>
     <w:p>
@@ -9453,7 +9453,7 @@
           <w:color w:val="7A7A7A"/>
           <w:sz w:val="16"/>
         </w:rPr>
-        <w:t>source · assessment.js:L1699  ·  renderStage1() — kind:'type-open'</w:t>
+        <w:t>source · assessment.js:L2078  ·  renderStage1() — kind:'type-open'</w:t>
       </w:r>
     </w:p>
     <w:p>
@@ -9477,7 +9477,7 @@
         <w:rPr>
           <w:sz w:val="21"/>
         </w:rPr>
-        <w:t>Is there anything about where your attention and energy naturally go that you’d like to add? (Optional)</w:t>
+        <w:t>Instinct patterns can be subtle. If there’s something about where your attention and energy naturally go that the statements didn’t quite land on, add it here.</w:t>
       </w:r>
     </w:p>
     <w:p>
@@ -9490,7 +9490,7 @@
           <w:color w:val="7A7A7A"/>
           <w:sz w:val="16"/>
         </w:rPr>
-        <w:t>source · assessment.js:L1700  ·  renderStage1() — kind:'instinct-open'</w:t>
+        <w:t>source · assessment.js:L2079  ·  renderStage1() — kind:'instinct-open'</w:t>
       </w:r>
     </w:p>
     <w:p>
@@ -9540,7 +9540,7 @@
           <w:color w:val="7A7A7A"/>
           <w:sz w:val="16"/>
         </w:rPr>
-        <w:t>source · assessment.js:L1566  ·  renderFinalOpen()</w:t>
+        <w:t>source · assessment.js:L1947  ·  renderFinalOpen()</w:t>
       </w:r>
     </w:p>
     <w:p/>
@@ -9638,7 +9638,7 @@
           <w:color w:val="7A7A7A"/>
           <w:sz w:val="16"/>
         </w:rPr>
-        <w:t>source · assessment.js:L1476  ·  renderWelcome()</w:t>
+        <w:t>source · assessment.js:L1683  ·  renderWelcome()</w:t>
       </w:r>
     </w:p>
     <w:p>
@@ -9699,7 +9699,7 @@
           <w:color w:val="7A7A7A"/>
           <w:sz w:val="16"/>
         </w:rPr>
-        <w:t>source · assessment.js:L1646  ·  renderCtAnalyzing()</w:t>
+        <w:t>source · assessment.js  ·  renderCtAnalyzing()</w:t>
       </w:r>
     </w:p>
     <w:p>
@@ -9762,7 +9762,7 @@
           <w:color w:val="7A7A7A"/>
           <w:sz w:val="16"/>
         </w:rPr>
-        <w:t>source · assessment.js:L1661  ·  renderCall1Analyzing()</w:t>
+        <w:t>source · assessment.js  ·  renderCall1Analyzing()</w:t>
       </w:r>
     </w:p>
     <w:p>
@@ -9812,7 +9812,7 @@
           <w:color w:val="7A7A7A"/>
           <w:sz w:val="16"/>
         </w:rPr>
-        <w:t>source · assessment.js:L2209  ·  renderProcessing()</w:t>
+        <w:t>source · assessment.js:L2361  ·  renderProcessing()</w:t>
       </w:r>
     </w:p>
     <w:p>
@@ -9899,7 +9899,7 @@
           <w:color w:val="7A7A7A"/>
           <w:sz w:val="16"/>
         </w:rPr>
-        <w:t>source · assessment.js:L1547  ·  renderConfirmation()</w:t>
+        <w:t>source · assessment.js  ·  renderConfirmation()</w:t>
       </w:r>
     </w:p>
     <w:p>
@@ -9973,7 +9973,7 @@
           <w:color w:val="7A7A7A"/>
           <w:sz w:val="16"/>
         </w:rPr>
-        <w:t>source · assessment.js:L2220  ·  renderError()</w:t>
+        <w:t>source · assessment.js:L2372  ·  renderError()</w:t>
       </w:r>
     </w:p>
     <w:p/>

</xml_diff>